<commit_message>
vault backup: 2026-04-29 23:45:41
</commit_message>
<xml_diff>
--- a/Курс 3/Проектирование БД/Курисовая/РПЗ_Кринкин.docx
+++ b/Курс 3/Проектирование БД/Курисовая/РПЗ_Кринкин.docx
@@ -1765,7 +1765,14 @@
     <w:sdt>
       <w:sdtPr>
         <w:rPr>
-          <w:lang w:val="ru-RU"/>
+          <w:rFonts w:ascii="Times New Roman" w:eastAsiaTheme="minorHAnsi" w:hAnsi="Times New Roman" w:cstheme="minorBidi"/>
+          <w:b w:val="0"/>
+          <w:bCs w:val="0"/>
+          <w:color w:val="auto"/>
+          <w:kern w:val="2"/>
+          <w:szCs w:val="24"/>
+          <w:lang w:val="ru-RU" w:eastAsia="en-US"/>
+          <w14:ligatures w14:val="standardContextual"/>
         </w:rPr>
         <w:id w:val="-1407845936"/>
         <w:docPartObj>
@@ -1775,13 +1782,7 @@
       </w:sdtPr>
       <w:sdtEndPr>
         <w:rPr>
-          <w:rFonts w:ascii="Times New Roman" w:eastAsiaTheme="minorHAnsi" w:hAnsi="Times New Roman" w:cstheme="minorBidi"/>
           <w:noProof/>
-          <w:color w:val="auto"/>
-          <w:kern w:val="2"/>
-          <w:szCs w:val="24"/>
-          <w:lang w:val="ru-US" w:eastAsia="en-US"/>
-          <w14:ligatures w14:val="standardContextual"/>
         </w:rPr>
       </w:sdtEndPr>
       <w:sdtContent>
@@ -1822,7 +1823,7 @@
               <w:i w:val="0"/>
               <w:iCs w:val="0"/>
               <w:noProof/>
-              <w:color w:val="EE0000"/>
+              <w:color w:val="70AD47" w:themeColor="accent6"/>
               <w:sz w:val="28"/>
               <w:szCs w:val="28"/>
             </w:rPr>
@@ -1876,7 +1877,7 @@
                 <w:i w:val="0"/>
                 <w:iCs w:val="0"/>
                 <w:noProof/>
-                <w:color w:val="EE0000"/>
+                <w:color w:val="70AD47" w:themeColor="accent6"/>
                 <w:sz w:val="28"/>
                 <w:szCs w:val="28"/>
                 <w:lang w:val="ru-RU"/>
@@ -1892,7 +1893,7 @@
                 <w:iCs w:val="0"/>
                 <w:noProof/>
                 <w:webHidden/>
-                <w:color w:val="EE0000"/>
+                <w:color w:val="70AD47" w:themeColor="accent6"/>
                 <w:sz w:val="28"/>
                 <w:szCs w:val="28"/>
               </w:rPr>
@@ -1907,7 +1908,7 @@
                 <w:iCs w:val="0"/>
                 <w:noProof/>
                 <w:webHidden/>
-                <w:color w:val="EE0000"/>
+                <w:color w:val="70AD47" w:themeColor="accent6"/>
                 <w:sz w:val="28"/>
                 <w:szCs w:val="28"/>
               </w:rPr>
@@ -1922,7 +1923,7 @@
                 <w:iCs w:val="0"/>
                 <w:noProof/>
                 <w:webHidden/>
-                <w:color w:val="EE0000"/>
+                <w:color w:val="70AD47" w:themeColor="accent6"/>
                 <w:sz w:val="28"/>
                 <w:szCs w:val="28"/>
               </w:rPr>
@@ -1937,7 +1938,7 @@
                 <w:iCs w:val="0"/>
                 <w:noProof/>
                 <w:webHidden/>
-                <w:color w:val="EE0000"/>
+                <w:color w:val="70AD47" w:themeColor="accent6"/>
                 <w:sz w:val="28"/>
                 <w:szCs w:val="28"/>
               </w:rPr>
@@ -1951,7 +1952,7 @@
                 <w:iCs w:val="0"/>
                 <w:noProof/>
                 <w:webHidden/>
-                <w:color w:val="EE0000"/>
+                <w:color w:val="70AD47" w:themeColor="accent6"/>
                 <w:sz w:val="28"/>
                 <w:szCs w:val="28"/>
               </w:rPr>
@@ -1966,7 +1967,7 @@
                 <w:iCs w:val="0"/>
                 <w:noProof/>
                 <w:webHidden/>
-                <w:color w:val="EE0000"/>
+                <w:color w:val="70AD47" w:themeColor="accent6"/>
                 <w:sz w:val="28"/>
                 <w:szCs w:val="28"/>
               </w:rPr>
@@ -1981,7 +1982,7 @@
                 <w:iCs w:val="0"/>
                 <w:noProof/>
                 <w:webHidden/>
-                <w:color w:val="EE0000"/>
+                <w:color w:val="70AD47" w:themeColor="accent6"/>
                 <w:sz w:val="28"/>
                 <w:szCs w:val="28"/>
               </w:rPr>
@@ -2003,7 +2004,7 @@
               <w:i w:val="0"/>
               <w:iCs w:val="0"/>
               <w:noProof/>
-              <w:color w:val="EE0000"/>
+              <w:color w:val="70AD47" w:themeColor="accent6"/>
               <w:sz w:val="28"/>
               <w:szCs w:val="28"/>
             </w:rPr>
@@ -2018,7 +2019,7 @@
                 <w:i w:val="0"/>
                 <w:iCs w:val="0"/>
                 <w:noProof/>
-                <w:color w:val="EE0000"/>
+                <w:color w:val="70AD47" w:themeColor="accent6"/>
                 <w:sz w:val="28"/>
                 <w:szCs w:val="28"/>
                 <w:lang w:val="ru-RU"/>
@@ -2034,7 +2035,7 @@
                 <w:iCs w:val="0"/>
                 <w:noProof/>
                 <w:webHidden/>
-                <w:color w:val="EE0000"/>
+                <w:color w:val="70AD47" w:themeColor="accent6"/>
                 <w:sz w:val="28"/>
                 <w:szCs w:val="28"/>
               </w:rPr>
@@ -2049,7 +2050,7 @@
                 <w:iCs w:val="0"/>
                 <w:noProof/>
                 <w:webHidden/>
-                <w:color w:val="EE0000"/>
+                <w:color w:val="70AD47" w:themeColor="accent6"/>
                 <w:sz w:val="28"/>
                 <w:szCs w:val="28"/>
               </w:rPr>
@@ -2064,7 +2065,7 @@
                 <w:iCs w:val="0"/>
                 <w:noProof/>
                 <w:webHidden/>
-                <w:color w:val="EE0000"/>
+                <w:color w:val="70AD47" w:themeColor="accent6"/>
                 <w:sz w:val="28"/>
                 <w:szCs w:val="28"/>
               </w:rPr>
@@ -2079,7 +2080,7 @@
                 <w:iCs w:val="0"/>
                 <w:noProof/>
                 <w:webHidden/>
-                <w:color w:val="EE0000"/>
+                <w:color w:val="70AD47" w:themeColor="accent6"/>
                 <w:sz w:val="28"/>
                 <w:szCs w:val="28"/>
               </w:rPr>
@@ -2093,7 +2094,7 @@
                 <w:iCs w:val="0"/>
                 <w:noProof/>
                 <w:webHidden/>
-                <w:color w:val="EE0000"/>
+                <w:color w:val="70AD47" w:themeColor="accent6"/>
                 <w:sz w:val="28"/>
                 <w:szCs w:val="28"/>
               </w:rPr>
@@ -2108,7 +2109,7 @@
                 <w:iCs w:val="0"/>
                 <w:noProof/>
                 <w:webHidden/>
-                <w:color w:val="EE0000"/>
+                <w:color w:val="70AD47" w:themeColor="accent6"/>
                 <w:sz w:val="28"/>
                 <w:szCs w:val="28"/>
               </w:rPr>
@@ -2123,7 +2124,7 @@
                 <w:iCs w:val="0"/>
                 <w:noProof/>
                 <w:webHidden/>
-                <w:color w:val="EE0000"/>
+                <w:color w:val="70AD47" w:themeColor="accent6"/>
                 <w:sz w:val="28"/>
                 <w:szCs w:val="28"/>
               </w:rPr>
@@ -2287,7 +2288,7 @@
               <w:i w:val="0"/>
               <w:iCs w:val="0"/>
               <w:noProof/>
-              <w:color w:val="EE0000"/>
+              <w:color w:val="FFC000"/>
               <w:sz w:val="28"/>
               <w:szCs w:val="28"/>
             </w:rPr>
@@ -2302,7 +2303,7 @@
                 <w:i w:val="0"/>
                 <w:iCs w:val="0"/>
                 <w:noProof/>
-                <w:color w:val="EE0000"/>
+                <w:color w:val="FFC000"/>
                 <w:sz w:val="28"/>
                 <w:szCs w:val="28"/>
                 <w:lang w:val="ru-RU"/>
@@ -2318,7 +2319,7 @@
                 <w:iCs w:val="0"/>
                 <w:noProof/>
                 <w:webHidden/>
-                <w:color w:val="EE0000"/>
+                <w:color w:val="FFC000"/>
                 <w:sz w:val="28"/>
                 <w:szCs w:val="28"/>
               </w:rPr>
@@ -2333,7 +2334,7 @@
                 <w:iCs w:val="0"/>
                 <w:noProof/>
                 <w:webHidden/>
-                <w:color w:val="EE0000"/>
+                <w:color w:val="FFC000"/>
                 <w:sz w:val="28"/>
                 <w:szCs w:val="28"/>
               </w:rPr>
@@ -2348,7 +2349,7 @@
                 <w:iCs w:val="0"/>
                 <w:noProof/>
                 <w:webHidden/>
-                <w:color w:val="EE0000"/>
+                <w:color w:val="FFC000"/>
                 <w:sz w:val="28"/>
                 <w:szCs w:val="28"/>
               </w:rPr>
@@ -2363,7 +2364,7 @@
                 <w:iCs w:val="0"/>
                 <w:noProof/>
                 <w:webHidden/>
-                <w:color w:val="EE0000"/>
+                <w:color w:val="FFC000"/>
                 <w:sz w:val="28"/>
                 <w:szCs w:val="28"/>
               </w:rPr>
@@ -2377,7 +2378,7 @@
                 <w:iCs w:val="0"/>
                 <w:noProof/>
                 <w:webHidden/>
-                <w:color w:val="EE0000"/>
+                <w:color w:val="FFC000"/>
                 <w:sz w:val="28"/>
                 <w:szCs w:val="28"/>
               </w:rPr>
@@ -2392,7 +2393,7 @@
                 <w:iCs w:val="0"/>
                 <w:noProof/>
                 <w:webHidden/>
-                <w:color w:val="EE0000"/>
+                <w:color w:val="FFC000"/>
                 <w:sz w:val="28"/>
                 <w:szCs w:val="28"/>
               </w:rPr>
@@ -2407,7 +2408,7 @@
                 <w:iCs w:val="0"/>
                 <w:noProof/>
                 <w:webHidden/>
-                <w:color w:val="EE0000"/>
+                <w:color w:val="FFC000"/>
                 <w:sz w:val="28"/>
                 <w:szCs w:val="28"/>
               </w:rPr>
@@ -2427,7 +2428,7 @@
               <w:b w:val="0"/>
               <w:bCs w:val="0"/>
               <w:noProof/>
-              <w:color w:val="EE0000"/>
+              <w:color w:val="FFC000"/>
               <w:sz w:val="28"/>
               <w:szCs w:val="28"/>
             </w:rPr>
@@ -2440,7 +2441,7 @@
                 <w:b w:val="0"/>
                 <w:bCs w:val="0"/>
                 <w:noProof/>
-                <w:color w:val="EE0000"/>
+                <w:color w:val="FFC000"/>
                 <w:sz w:val="28"/>
                 <w:szCs w:val="28"/>
                 <w:lang w:val="ru-RU"/>
@@ -2454,7 +2455,7 @@
                 <w:bCs w:val="0"/>
                 <w:noProof/>
                 <w:webHidden/>
-                <w:color w:val="EE0000"/>
+                <w:color w:val="FFC000"/>
                 <w:sz w:val="28"/>
                 <w:szCs w:val="28"/>
               </w:rPr>
@@ -2467,7 +2468,7 @@
                 <w:bCs w:val="0"/>
                 <w:noProof/>
                 <w:webHidden/>
-                <w:color w:val="EE0000"/>
+                <w:color w:val="FFC000"/>
                 <w:sz w:val="28"/>
                 <w:szCs w:val="28"/>
               </w:rPr>
@@ -2480,7 +2481,7 @@
                 <w:bCs w:val="0"/>
                 <w:noProof/>
                 <w:webHidden/>
-                <w:color w:val="EE0000"/>
+                <w:color w:val="FFC000"/>
                 <w:sz w:val="28"/>
                 <w:szCs w:val="28"/>
               </w:rPr>
@@ -2493,7 +2494,7 @@
                 <w:bCs w:val="0"/>
                 <w:noProof/>
                 <w:webHidden/>
-                <w:color w:val="EE0000"/>
+                <w:color w:val="FFC000"/>
                 <w:sz w:val="28"/>
                 <w:szCs w:val="28"/>
               </w:rPr>
@@ -2505,7 +2506,7 @@
                 <w:bCs w:val="0"/>
                 <w:noProof/>
                 <w:webHidden/>
-                <w:color w:val="EE0000"/>
+                <w:color w:val="FFC000"/>
                 <w:sz w:val="28"/>
                 <w:szCs w:val="28"/>
               </w:rPr>
@@ -2518,7 +2519,7 @@
                 <w:bCs w:val="0"/>
                 <w:noProof/>
                 <w:webHidden/>
-                <w:color w:val="EE0000"/>
+                <w:color w:val="FFC000"/>
                 <w:sz w:val="28"/>
                 <w:szCs w:val="28"/>
               </w:rPr>
@@ -2531,7 +2532,7 @@
                 <w:bCs w:val="0"/>
                 <w:noProof/>
                 <w:webHidden/>
-                <w:color w:val="EE0000"/>
+                <w:color w:val="FFC000"/>
                 <w:sz w:val="28"/>
                 <w:szCs w:val="28"/>
               </w:rPr>
@@ -2548,7 +2549,7 @@
             <w:rPr>
               <w:rFonts w:ascii="Times New Roman" w:hAnsi="Times New Roman" w:cs="Times New Roman"/>
               <w:noProof/>
-              <w:color w:val="EE0000"/>
+              <w:color w:val="70AD47" w:themeColor="accent6"/>
               <w:sz w:val="28"/>
               <w:szCs w:val="28"/>
             </w:rPr>
@@ -2559,7 +2560,7 @@
                 <w:rStyle w:val="af2"/>
                 <w:rFonts w:ascii="Times New Roman" w:hAnsi="Times New Roman" w:cs="Times New Roman"/>
                 <w:noProof/>
-                <w:color w:val="EE0000"/>
+                <w:color w:val="70AD47" w:themeColor="accent6"/>
                 <w:sz w:val="28"/>
                 <w:szCs w:val="28"/>
                 <w:lang w:val="ru-RU"/>
@@ -2571,7 +2572,7 @@
                 <w:rStyle w:val="af2"/>
                 <w:rFonts w:ascii="Times New Roman" w:hAnsi="Times New Roman" w:cs="Times New Roman"/>
                 <w:noProof/>
-                <w:color w:val="EE0000"/>
+                <w:color w:val="70AD47" w:themeColor="accent6"/>
                 <w:sz w:val="28"/>
                 <w:szCs w:val="28"/>
               </w:rPr>
@@ -2582,7 +2583,7 @@
                 <w:rFonts w:ascii="Times New Roman" w:hAnsi="Times New Roman" w:cs="Times New Roman"/>
                 <w:noProof/>
                 <w:webHidden/>
-                <w:color w:val="EE0000"/>
+                <w:color w:val="70AD47" w:themeColor="accent6"/>
                 <w:sz w:val="28"/>
                 <w:szCs w:val="28"/>
               </w:rPr>
@@ -2593,7 +2594,7 @@
                 <w:rFonts w:ascii="Times New Roman" w:hAnsi="Times New Roman" w:cs="Times New Roman"/>
                 <w:noProof/>
                 <w:webHidden/>
-                <w:color w:val="EE0000"/>
+                <w:color w:val="70AD47" w:themeColor="accent6"/>
                 <w:sz w:val="28"/>
                 <w:szCs w:val="28"/>
               </w:rPr>
@@ -2604,7 +2605,7 @@
                 <w:rFonts w:ascii="Times New Roman" w:hAnsi="Times New Roman" w:cs="Times New Roman"/>
                 <w:noProof/>
                 <w:webHidden/>
-                <w:color w:val="EE0000"/>
+                <w:color w:val="70AD47" w:themeColor="accent6"/>
                 <w:sz w:val="28"/>
                 <w:szCs w:val="28"/>
               </w:rPr>
@@ -2615,7 +2616,7 @@
                 <w:rFonts w:ascii="Times New Roman" w:hAnsi="Times New Roman" w:cs="Times New Roman"/>
                 <w:noProof/>
                 <w:webHidden/>
-                <w:color w:val="EE0000"/>
+                <w:color w:val="70AD47" w:themeColor="accent6"/>
                 <w:sz w:val="28"/>
                 <w:szCs w:val="28"/>
               </w:rPr>
@@ -2625,7 +2626,7 @@
                 <w:rFonts w:ascii="Times New Roman" w:hAnsi="Times New Roman" w:cs="Times New Roman"/>
                 <w:noProof/>
                 <w:webHidden/>
-                <w:color w:val="EE0000"/>
+                <w:color w:val="70AD47" w:themeColor="accent6"/>
                 <w:sz w:val="28"/>
                 <w:szCs w:val="28"/>
               </w:rPr>
@@ -2636,7 +2637,7 @@
                 <w:rFonts w:ascii="Times New Roman" w:hAnsi="Times New Roman" w:cs="Times New Roman"/>
                 <w:noProof/>
                 <w:webHidden/>
-                <w:color w:val="EE0000"/>
+                <w:color w:val="70AD47" w:themeColor="accent6"/>
                 <w:sz w:val="28"/>
                 <w:szCs w:val="28"/>
               </w:rPr>
@@ -2647,7 +2648,7 @@
                 <w:rFonts w:ascii="Times New Roman" w:hAnsi="Times New Roman" w:cs="Times New Roman"/>
                 <w:noProof/>
                 <w:webHidden/>
-                <w:color w:val="EE0000"/>
+                <w:color w:val="70AD47" w:themeColor="accent6"/>
                 <w:sz w:val="28"/>
                 <w:szCs w:val="28"/>
               </w:rPr>
@@ -3711,6 +3712,203 @@
     </w:p>
     <w:p>
       <w:pPr>
+        <w:rPr>
+          <w:lang w:val="ru-RU"/>
+        </w:rPr>
+      </w:pPr>
+      <w:r>
+        <w:rPr>
+          <w:lang w:val="ru-RU"/>
+        </w:rPr>
+        <w:t>В настоящее время вся деятельность человека немыслима без использования</w:t>
+      </w:r>
+      <w:r>
+        <w:rPr>
+          <w:lang w:val="ru-RU"/>
+        </w:rPr>
+        <w:t xml:space="preserve"> </w:t>
+      </w:r>
+      <w:r>
+        <w:rPr>
+          <w:lang w:val="ru-RU"/>
+        </w:rPr>
+        <w:t>компьютера.</w:t>
+      </w:r>
+    </w:p>
+    <w:p>
+      <w:pPr>
+        <w:rPr>
+          <w:lang w:val="ru-RU"/>
+        </w:rPr>
+      </w:pPr>
+      <w:r>
+        <w:rPr>
+          <w:lang w:val="ru-RU"/>
+        </w:rPr>
+        <w:t>Агентство недвижимости представляет собой фирму, которая предоставляет</w:t>
+      </w:r>
+      <w:r>
+        <w:rPr>
+          <w:lang w:val="ru-RU"/>
+        </w:rPr>
+        <w:t xml:space="preserve"> </w:t>
+      </w:r>
+      <w:r>
+        <w:rPr>
+          <w:lang w:val="ru-RU"/>
+        </w:rPr>
+        <w:t>качественное сопровождение массы операций, которые могут проводиться на рынке</w:t>
+      </w:r>
+      <w:r>
+        <w:rPr>
+          <w:lang w:val="ru-RU"/>
+        </w:rPr>
+        <w:t xml:space="preserve"> </w:t>
+      </w:r>
+      <w:r>
+        <w:rPr>
+          <w:lang w:val="ru-RU"/>
+        </w:rPr>
+        <w:t>недвижимости. Прежде всего, такие компании занимаются продажей и покупкой жилого</w:t>
+      </w:r>
+      <w:r>
+        <w:rPr>
+          <w:lang w:val="ru-RU"/>
+        </w:rPr>
+        <w:t xml:space="preserve"> </w:t>
+      </w:r>
+      <w:r>
+        <w:rPr>
+          <w:lang w:val="ru-RU"/>
+        </w:rPr>
+        <w:t>имущества.</w:t>
+      </w:r>
+    </w:p>
+    <w:p>
+      <w:pPr>
+        <w:rPr>
+          <w:lang w:val="en-US"/>
+        </w:rPr>
+      </w:pPr>
+      <w:r>
+        <w:rPr>
+          <w:lang w:val="ru-RU"/>
+        </w:rPr>
+        <w:t>Такие предприятия обладают массой преимуществ, которые связаны с наличием</w:t>
+      </w:r>
+      <w:r>
+        <w:rPr>
+          <w:lang w:val="ru-RU"/>
+        </w:rPr>
+        <w:t xml:space="preserve"> </w:t>
+      </w:r>
+      <w:r>
+        <w:rPr>
+          <w:lang w:val="ru-RU"/>
+        </w:rPr>
+        <w:t>объемной базы вариантов различной недвижимости. Ежедневно сотрудники агентство,</w:t>
+      </w:r>
+      <w:r>
+        <w:rPr>
+          <w:lang w:val="ru-RU"/>
+        </w:rPr>
+        <w:t xml:space="preserve"> </w:t>
+      </w:r>
+      <w:r>
+        <w:rPr>
+          <w:lang w:val="ru-RU"/>
+        </w:rPr>
+        <w:t>занимающихся недвижимостью, улучшают данную базу, путем ее расширения. Так что,</w:t>
+      </w:r>
+      <w:r>
+        <w:rPr>
+          <w:lang w:val="ru-RU"/>
+        </w:rPr>
+        <w:t xml:space="preserve"> </w:t>
+      </w:r>
+      <w:r>
+        <w:rPr>
+          <w:lang w:val="ru-RU"/>
+        </w:rPr>
+        <w:t>если вдруг вы решите сами найти квартиру или земельный участок придется очень много</w:t>
+      </w:r>
+      <w:r>
+        <w:rPr>
+          <w:lang w:val="ru-RU"/>
+        </w:rPr>
+        <w:t xml:space="preserve"> </w:t>
+      </w:r>
+      <w:r>
+        <w:rPr>
+          <w:lang w:val="ru-RU"/>
+        </w:rPr>
+        <w:t>тратить времени, когда подобные компании на это могут потратить всего несколько минут</w:t>
+      </w:r>
+      <w:r>
+        <w:rPr>
+          <w:lang w:val="ru-RU"/>
+        </w:rPr>
+        <w:t xml:space="preserve"> </w:t>
+      </w:r>
+      <w:r>
+        <w:rPr>
+          <w:lang w:val="ru-RU"/>
+        </w:rPr>
+        <w:t>[2].</w:t>
+      </w:r>
+    </w:p>
+    <w:p>
+      <w:pPr>
+        <w:rPr>
+          <w:lang w:val="en-US"/>
+        </w:rPr>
+      </w:pPr>
+      <w:r>
+        <w:rPr>
+          <w:lang w:val="ru-RU"/>
+        </w:rPr>
+        <w:t xml:space="preserve">На данный момент сотрудники агентства тратят много сил на обработку информации и поиск актуального и подходящего предложения покупателю (съёмщику) или </w:t>
+      </w:r>
+      <w:r>
+        <w:rPr>
+          <w:lang w:val="ru-RU"/>
+        </w:rPr>
+        <w:t>потенциальных покупателей для продавца (арендодателя). Решить эту проблему можно при помощи внедрения автоматизированной системы, которая бы хранила всю информацию обо всех сделках и предложениях и предоставляла инструменты для быстрого поиска среди них.</w:t>
+      </w:r>
+    </w:p>
+    <w:p>
+      <w:pPr>
+        <w:rPr>
+          <w:lang w:val="ru-RU"/>
+        </w:rPr>
+      </w:pPr>
+      <w:r>
+        <w:rPr>
+          <w:lang w:val="ru-RU"/>
+        </w:rPr>
+        <w:t xml:space="preserve">Целью данной курсовой работы является создание базы данных, которая содержит актуальную информацию о </w:t>
+      </w:r>
+      <w:r>
+        <w:rPr>
+          <w:lang w:val="ru-RU"/>
+        </w:rPr>
+        <w:t>актуальных сделках недвижимости, состоянии объектов, продавцах и покупателях и др., а также разработка программы, позволяющей работать с этой базой данных.</w:t>
+      </w:r>
+      <w:r>
+        <w:rPr>
+          <w:lang w:val="ru-RU"/>
+        </w:rPr>
+        <w:t xml:space="preserve"> Внедрение этой программы позволит снизить нагрузку на сотрудников агентства недвижимости и позволять им находить более релевантные предложения для клиентов</w:t>
+      </w:r>
+      <w:r>
+        <w:rPr>
+          <w:lang w:val="ru-RU"/>
+        </w:rPr>
+        <w:t>, а также грамотно организовываться свою работу.</w:t>
+      </w:r>
+    </w:p>
+    <w:p>
+      <w:pPr>
         <w:spacing w:after="160" w:line="278" w:lineRule="auto"/>
         <w:ind w:firstLine="0"/>
         <w:jc w:val="left"/>
@@ -3748,11 +3946,345 @@
           <w:lang w:val="ru-RU"/>
         </w:rPr>
       </w:pPr>
-    </w:p>
-    <w:p>
-      <w:pPr>
+      <w:r>
+        <w:t>В наши дни в России возмездное оказание услуг занимает важное место в гражданском обороте. Сюда же относятся и обязательства по оказанию риелторских услуг на рынке недвижимости. За последние годы появилось внушительное сообщество риелторов, которые являются посредниками на рынке недвижимости. Деятельность риелторов, являющихся профессиональными субъектами рынка недвижимости, помогает участникам гражданского оборота в получении разных услуг, которые касаются операций с недвижимым имуществом. При этом клиенты риелторов экономят время и средства.</w:t>
+      </w:r>
+    </w:p>
+    <w:p>
+      <w:pPr>
+        <w:rPr>
+          <w:lang w:val="ru-RU"/>
+        </w:rPr>
+      </w:pPr>
+      <w:r>
+        <w:t>В наше время риелторская деятельность считается довольно распространённым видом деятельности в России. Под риелторской деятельностью понимают деятельность индивидуальных предпринимателей и (или) частных фирм на основе соглашения либо договорённости с заинтересованным лицом по оказанию услуг при совершении различных операций с недвижимостью за определённое вознаграждение, осуществляемую на постоянной основе. Также риелторской деятельностью считают иную коммерческую профессиональную деятельность на рынке недвижимости.</w:t>
+      </w:r>
+    </w:p>
+    <w:p>
+      <w:pPr>
+        <w:rPr>
+          <w:lang w:val="ru-RU"/>
+        </w:rPr>
+      </w:pPr>
+      <w:r>
+        <w:t>Риелторскими услугами называются услуги, которые оказываются клиенту при осуществлении риелторской деятельности. Юридическое лицо или индивидуальный предприниматель, которые занимаются риелторской деятельностью на рынке услуг в области оборота объектов недвижимости и управления недвижимым имуществом, являются профессиональными участниками рынка недвижимого имущества.</w:t>
+      </w:r>
+    </w:p>
+    <w:p>
+      <w:pPr>
+        <w:rPr>
+          <w:lang w:val="ru-RU"/>
+        </w:rPr>
+      </w:pPr>
+      <w:r>
+        <w:t>Любая риелторская услуга включает в себя две части: подготовка к сделке и проведение сделки. Подготовка к сделке состоит из нескольких последовательных шагов.</w:t>
+      </w:r>
+    </w:p>
+    <w:p>
+      <w:pPr>
+        <w:rPr>
+          <w:lang w:val="ru-RU"/>
+        </w:rPr>
+      </w:pPr>
+      <w:r>
+        <w:t>Сначала клиент обращается к риелтору и высказывает ему свои пожелания, касающиеся того, хочет ли он продать, приобрести, арендовать недвижимое имущество либо совершить другую сделку с ним. Далее клиент должен ознакомиться с условиями работы риелтора. Если клиента всё устраивает, заключается договор. При покупке недвижимости фиксируются требования покупателя к ней, риелтор осуществляет подбор соответствующих требованиям вариантов. В случае продажи недвижимого имущества риелтор производит сбор и проверку необходимых документов, изучает спрос, размещает рекламу в средствах массовой информации, помогает устроить показ недвижимости.</w:t>
+      </w:r>
+      <w:r>
+        <w:rPr>
+          <w:lang w:val="ru-RU"/>
+        </w:rPr>
+        <w:t xml:space="preserve"> </w:t>
+      </w:r>
+    </w:p>
+    <w:p>
+      <w:pPr>
+        <w:rPr>
+          <w:lang w:val="ru-RU"/>
+        </w:rPr>
+      </w:pPr>
+      <w:r>
+        <w:t>Когда продавец и покупатель при помощи риелтора находят друг друга, они согласовывают условия сделки: стоимость объекта недвижимого имущества, сроки заключения сделки, сроки освобождения объекта недвижимости, порядок оплаты и т. д.</w:t>
+      </w:r>
+      <w:r>
+        <w:rPr>
+          <w:lang w:val="ru-RU"/>
+        </w:rPr>
+        <w:t xml:space="preserve"> </w:t>
+      </w:r>
+      <w:r>
+        <w:rPr>
+          <w:lang w:val="ru-RU"/>
+        </w:rPr>
+        <w:t>[3]</w:t>
+      </w:r>
+      <w:r>
+        <w:rPr>
+          <w:lang w:val="ru-RU"/>
+        </w:rPr>
+        <w:t>.</w:t>
+      </w:r>
+    </w:p>
+    <w:p>
+      <w:pPr>
+        <w:rPr>
+          <w:lang w:val="ru-RU"/>
+        </w:rPr>
+      </w:pPr>
+      <w:r>
+        <w:rPr>
+          <w:lang w:val="ru-RU"/>
+        </w:rPr>
+        <w:t>Согласно</w:t>
+      </w:r>
+      <w:r>
+        <w:rPr>
+          <w:lang w:val="ru-RU"/>
+        </w:rPr>
+        <w:t xml:space="preserve"> </w:t>
+      </w:r>
+      <w:r>
+        <w:rPr>
+          <w:lang w:val="ru-RU"/>
+        </w:rPr>
+        <w:t>стандартам профессиональной деятельности</w:t>
+      </w:r>
+      <w:r>
+        <w:rPr>
+          <w:lang w:val="ru-RU"/>
+        </w:rPr>
+        <w:t xml:space="preserve"> </w:t>
+      </w:r>
+      <w:r>
+        <w:rPr>
+          <w:lang w:val="ru-RU"/>
+        </w:rPr>
+        <w:t>[</w:t>
+      </w:r>
+      <w:r>
+        <w:rPr>
+          <w:lang w:val="ru-RU"/>
+        </w:rPr>
+        <w:t>4</w:t>
+      </w:r>
+      <w:r>
+        <w:rPr>
+          <w:lang w:val="ru-RU"/>
+        </w:rPr>
+        <w:t>]</w:t>
+      </w:r>
+      <w:r>
+        <w:rPr>
+          <w:lang w:val="ru-RU"/>
+        </w:rPr>
+        <w:t>, для работы с объектом агентству необходимы данные, позволяющие его однозначно идентифицировать:</w:t>
+      </w:r>
+    </w:p>
+    <w:p>
+      <w:pPr>
+        <w:pStyle w:val="a7"/>
+        <w:numPr>
+          <w:ilvl w:val="0"/>
+          <w:numId w:val="10"/>
+        </w:numPr>
         <w:spacing w:after="160" w:line="278" w:lineRule="auto"/>
-        <w:ind w:firstLine="0"/>
+        <w:jc w:val="left"/>
+        <w:rPr>
+          <w:lang w:val="ru-RU"/>
+        </w:rPr>
+      </w:pPr>
+      <w:r>
+        <w:rPr>
+          <w:lang w:val="ru-RU"/>
+        </w:rPr>
+        <w:lastRenderedPageBreak/>
+        <w:t>Технические характеристики: Точный адрес, общая и жилая площадь, количество комнат, материал стен, год постройки, состояние объекта (износ) и наличие перепланировок.</w:t>
+      </w:r>
+    </w:p>
+    <w:p>
+      <w:pPr>
+        <w:pStyle w:val="a7"/>
+        <w:numPr>
+          <w:ilvl w:val="0"/>
+          <w:numId w:val="10"/>
+        </w:numPr>
+        <w:spacing w:after="160" w:line="278" w:lineRule="auto"/>
+        <w:jc w:val="left"/>
+        <w:rPr>
+          <w:lang w:val="ru-RU"/>
+        </w:rPr>
+      </w:pPr>
+      <w:r>
+        <w:rPr>
+          <w:lang w:val="ru-RU"/>
+        </w:rPr>
+        <w:t>Правовой статус: Сведения из ЕГРН (права собственности, наличие обременений, арестов или залогов).</w:t>
+      </w:r>
+    </w:p>
+    <w:p>
+      <w:pPr>
+        <w:pStyle w:val="a7"/>
+        <w:numPr>
+          <w:ilvl w:val="0"/>
+          <w:numId w:val="10"/>
+        </w:numPr>
+        <w:spacing w:after="160" w:line="278" w:lineRule="auto"/>
+        <w:jc w:val="left"/>
+        <w:rPr>
+          <w:lang w:val="ru-RU"/>
+        </w:rPr>
+      </w:pPr>
+      <w:r>
+        <w:rPr>
+          <w:lang w:val="ru-RU"/>
+        </w:rPr>
+        <w:t>Финансовая чистота: Информация о задолженностях по коммунальным платежам, налогам и капитальному ремонту.</w:t>
+      </w:r>
+    </w:p>
+    <w:p>
+      <w:pPr>
+        <w:pStyle w:val="a7"/>
+        <w:numPr>
+          <w:ilvl w:val="0"/>
+          <w:numId w:val="10"/>
+        </w:numPr>
+        <w:spacing w:after="160" w:line="278" w:lineRule="auto"/>
+        <w:jc w:val="left"/>
+        <w:rPr>
+          <w:lang w:val="ru-RU"/>
+        </w:rPr>
+      </w:pPr>
+      <w:r>
+        <w:rPr>
+          <w:lang w:val="ru-RU"/>
+        </w:rPr>
+        <w:t>Идентификационные данные: Паспортные сведения, полномочия представителей (нотариальные доверенности).</w:t>
+      </w:r>
+    </w:p>
+    <w:p>
+      <w:pPr>
+        <w:pStyle w:val="a7"/>
+        <w:numPr>
+          <w:ilvl w:val="0"/>
+          <w:numId w:val="10"/>
+        </w:numPr>
+        <w:spacing w:after="160" w:line="278" w:lineRule="auto"/>
+        <w:jc w:val="left"/>
+        <w:rPr>
+          <w:lang w:val="ru-RU"/>
+        </w:rPr>
+      </w:pPr>
+      <w:r>
+        <w:rPr>
+          <w:lang w:val="ru-RU"/>
+        </w:rPr>
+        <w:t>Правоспособность: Сведения о семейном положении (согласие супруга), наличии несовершеннолетних собственников (разрешение органов опеки), а также проверка на предмет банкротства физического лица.</w:t>
+      </w:r>
+    </w:p>
+    <w:p>
+      <w:pPr>
+        <w:pStyle w:val="a7"/>
+        <w:numPr>
+          <w:ilvl w:val="0"/>
+          <w:numId w:val="10"/>
+        </w:numPr>
+        <w:spacing w:after="160" w:line="278" w:lineRule="auto"/>
+        <w:jc w:val="left"/>
+        <w:rPr>
+          <w:lang w:val="ru-RU"/>
+        </w:rPr>
+      </w:pPr>
+      <w:r>
+        <w:rPr>
+          <w:lang w:val="ru-RU"/>
+        </w:rPr>
+        <w:t>Информация об</w:t>
+      </w:r>
+      <w:r>
+        <w:rPr>
+          <w:lang w:val="ru-RU"/>
+        </w:rPr>
+        <w:t xml:space="preserve"> объекто</w:t>
+      </w:r>
+      <w:r>
+        <w:rPr>
+          <w:lang w:val="ru-RU"/>
+        </w:rPr>
+        <w:t>х</w:t>
+      </w:r>
+      <w:r>
+        <w:rPr>
+          <w:lang w:val="ru-RU"/>
+        </w:rPr>
+        <w:t>-аналог</w:t>
+      </w:r>
+      <w:r>
+        <w:rPr>
+          <w:lang w:val="ru-RU"/>
+        </w:rPr>
+        <w:t>ах</w:t>
+      </w:r>
+      <w:r>
+        <w:rPr>
+          <w:lang w:val="ru-RU"/>
+        </w:rPr>
+        <w:t>: Информация о текущих предложениях на рынке для проведения сравнительного анализа цен.</w:t>
+      </w:r>
+    </w:p>
+    <w:p>
+      <w:pPr>
+        <w:pStyle w:val="a7"/>
+        <w:numPr>
+          <w:ilvl w:val="0"/>
+          <w:numId w:val="10"/>
+        </w:numPr>
+        <w:spacing w:after="160" w:line="278" w:lineRule="auto"/>
+        <w:jc w:val="left"/>
+        <w:rPr>
+          <w:lang w:val="ru-RU"/>
+        </w:rPr>
+      </w:pPr>
+      <w:r>
+        <w:rPr>
+          <w:lang w:val="ru-RU"/>
+        </w:rPr>
+        <w:t>Архив сделок: Сведения о реально совершенных сделках (цена продажи в отличие от цены предложения), что позволяет формировать адекватную рыночную оценку.</w:t>
+      </w:r>
+    </w:p>
+    <w:p>
+      <w:pPr>
+        <w:spacing w:after="160" w:line="278" w:lineRule="auto"/>
+        <w:jc w:val="left"/>
+        <w:rPr>
+          <w:lang w:val="ru-RU"/>
+        </w:rPr>
+      </w:pPr>
+      <w:r>
+        <w:rPr>
+          <w:lang w:val="ru-RU"/>
+        </w:rPr>
+        <w:t>Такой объём информации крайне трудоёмко обрабатывать вручную</w:t>
+      </w:r>
+      <w:r>
+        <w:rPr>
+          <w:lang w:val="ru-RU"/>
+        </w:rPr>
+        <w:t>, п</w:t>
+      </w:r>
+      <w:r>
+        <w:rPr>
+          <w:lang w:val="ru-RU"/>
+        </w:rPr>
+        <w:t>оэтому требуется разработать систему автоматизации хранения и обработки этих данных.</w:t>
+      </w:r>
+    </w:p>
+    <w:p>
+      <w:pPr>
+        <w:pStyle w:val="a7"/>
+        <w:numPr>
+          <w:ilvl w:val="0"/>
+          <w:numId w:val="10"/>
+        </w:numPr>
+        <w:spacing w:after="160" w:line="278" w:lineRule="auto"/>
         <w:jc w:val="left"/>
         <w:rPr>
           <w:lang w:val="ru-RU"/>
@@ -3940,25 +4472,7 @@
         <w:rPr>
           <w:lang w:val="ru-RU"/>
         </w:rPr>
-        <w:t>3.1.</w:t>
-      </w:r>
-      <w:r>
-        <w:rPr>
-          <w:lang w:val="ru-RU"/>
-        </w:rPr>
-        <w:t>2</w:t>
-      </w:r>
-      <w:r>
-        <w:rPr>
-          <w:lang w:val="ru-RU"/>
-        </w:rPr>
-        <w:t xml:space="preserve">. </w:t>
-      </w:r>
-      <w:r>
-        <w:rPr>
-          <w:lang w:val="ru-RU"/>
-        </w:rPr>
-        <w:t>Первая нормальная форма</w:t>
+        <w:t>3.1.2. Первая нормальная форма</w:t>
       </w:r>
       <w:bookmarkEnd w:id="8"/>
     </w:p>
@@ -3981,31 +4495,7 @@
         <w:rPr>
           <w:lang w:val="ru-RU"/>
         </w:rPr>
-        <w:t>3.1.</w:t>
-      </w:r>
-      <w:r>
-        <w:rPr>
-          <w:lang w:val="ru-RU"/>
-        </w:rPr>
-        <w:t>3</w:t>
-      </w:r>
-      <w:r>
-        <w:rPr>
-          <w:lang w:val="ru-RU"/>
-        </w:rPr>
-        <w:t xml:space="preserve">. </w:t>
-      </w:r>
-      <w:r>
-        <w:rPr>
-          <w:lang w:val="ru-RU"/>
-        </w:rPr>
-        <w:t>Вторая</w:t>
-      </w:r>
-      <w:r>
-        <w:rPr>
-          <w:lang w:val="ru-RU"/>
-        </w:rPr>
-        <w:t xml:space="preserve"> нормальная форма</w:t>
+        <w:t>3.1.3. Вторая нормальная форма</w:t>
       </w:r>
       <w:bookmarkEnd w:id="9"/>
     </w:p>
@@ -4028,31 +4518,7 @@
         <w:rPr>
           <w:lang w:val="ru-RU"/>
         </w:rPr>
-        <w:t>3.1.</w:t>
-      </w:r>
-      <w:r>
-        <w:rPr>
-          <w:lang w:val="ru-RU"/>
-        </w:rPr>
-        <w:t>4</w:t>
-      </w:r>
-      <w:r>
-        <w:rPr>
-          <w:lang w:val="ru-RU"/>
-        </w:rPr>
-        <w:t xml:space="preserve">. </w:t>
-      </w:r>
-      <w:r>
-        <w:rPr>
-          <w:lang w:val="ru-RU"/>
-        </w:rPr>
-        <w:t>Третья</w:t>
-      </w:r>
-      <w:r>
-        <w:rPr>
-          <w:lang w:val="ru-RU"/>
-        </w:rPr>
-        <w:t xml:space="preserve"> нормальная форма</w:t>
+        <w:t>3.1.4. Третья нормальная форма</w:t>
       </w:r>
       <w:bookmarkEnd w:id="10"/>
     </w:p>
@@ -4234,22 +4700,58 @@
           <w:szCs w:val="28"/>
         </w:rPr>
       </w:pPr>
-    </w:p>
-    <w:p>
-      <w:pPr>
+      <w:r>
+        <w:rPr>
+          <w:szCs w:val="28"/>
+        </w:rPr>
+        <w:t>Михайлова, С. Е. Разработка нечеткой экспертной системы в среде MATLAB для агенства по продаже недвижимости / С. Е. Михайлова, А. Ю. Пучков // Новая наука: Современное состояние и пути развития. – 2016. – № 3-1. – С. 173-175.</w:t>
+      </w:r>
+    </w:p>
+    <w:p>
+      <w:pPr>
+        <w:pStyle w:val="a7"/>
+        <w:numPr>
+          <w:ilvl w:val="0"/>
+          <w:numId w:val="1"/>
+        </w:numPr>
         <w:spacing w:after="160" w:line="259" w:lineRule="auto"/>
-        <w:rPr>
-          <w:szCs w:val="28"/>
-          <w:lang w:val="ru-RU"/>
-        </w:rPr>
-      </w:pPr>
-    </w:p>
-    <w:p>
-      <w:pPr>
+        <w:ind w:left="0" w:firstLine="426"/>
+        <w:rPr>
+          <w:szCs w:val="28"/>
+        </w:rPr>
+      </w:pPr>
+      <w:r>
+        <w:t>Филатова, А. В. Понятие и сущность риелторской деятельности и риелторских услуг / А. В. Филатова. — Текст : непосредственный // Молодой ученый. — 2019. — № 12 (250). — С. 206-208.</w:t>
+      </w:r>
+    </w:p>
+    <w:p>
+      <w:pPr>
+        <w:pStyle w:val="a7"/>
+        <w:numPr>
+          <w:ilvl w:val="0"/>
+          <w:numId w:val="1"/>
+        </w:numPr>
         <w:spacing w:after="160" w:line="259" w:lineRule="auto"/>
-        <w:rPr>
-          <w:szCs w:val="28"/>
-          <w:lang w:val="ru-RU"/>
+        <w:ind w:left="0" w:firstLine="426"/>
+        <w:rPr>
+          <w:szCs w:val="28"/>
+        </w:rPr>
+      </w:pPr>
+      <w:r>
+        <w:t>Система добровольной сертификации услуг на рынке недвижимости Российской Федерации : зарегистрирована в Государственном реестре Госстандарта РФ 08.02.2002 г., рег. № РОСС RU.046.04 РН00 / Российская Гильдия Риэлторов. — Москва : РГР, 2002.</w:t>
+      </w:r>
+    </w:p>
+    <w:p>
+      <w:pPr>
+        <w:pStyle w:val="a7"/>
+        <w:numPr>
+          <w:ilvl w:val="0"/>
+          <w:numId w:val="1"/>
+        </w:numPr>
+        <w:spacing w:after="160" w:line="259" w:lineRule="auto"/>
+        <w:ind w:left="0" w:firstLine="426"/>
+        <w:rPr>
+          <w:szCs w:val="28"/>
         </w:rPr>
       </w:pPr>
     </w:p>
@@ -5680,7 +6182,7 @@
           <w:lang w:val="ru-RU"/>
           <w14:ligatures w14:val="none"/>
         </w:rPr>
-        <w:t>риелторской конторы</w:t>
+        <w:t>агентства недвижимости</w:t>
       </w:r>
       <w:r>
         <w:rPr>
@@ -5717,24 +6219,34 @@
       <w:r>
         <w:rPr>
           <w:rFonts w:eastAsia="Times New Roman" w:cs="Times New Roman"/>
-          <w:color w:val="EE0000"/>
-          <w:kern w:val="0"/>
-          <w:szCs w:val="28"/>
-          <w:lang w:val="ru-RU"/>
-          <w14:ligatures w14:val="none"/>
-        </w:rPr>
-        <w:t>маршрутах общественного транспорта, расписаниях, тарифах, способах оплаты и упростить получение данной информации для пассажиров</w:t>
-      </w:r>
-      <w:r>
-        <w:rPr>
-          <w:rFonts w:eastAsia="Times New Roman" w:cs="Times New Roman"/>
-          <w:color w:val="000000" w:themeColor="text1"/>
-          <w:kern w:val="0"/>
-          <w:szCs w:val="28"/>
-          <w:lang w:val="ru-RU"/>
-          <w14:ligatures w14:val="none"/>
-        </w:rPr>
-        <w:t>.</w:t>
+          <w:kern w:val="0"/>
+          <w:szCs w:val="28"/>
+          <w:lang w:val="ru-RU"/>
+          <w14:ligatures w14:val="none"/>
+        </w:rPr>
+        <w:t xml:space="preserve">клиентах </w:t>
+      </w:r>
+      <w:proofErr w:type="spellStart"/>
+      <w:r>
+        <w:rPr>
+          <w:rFonts w:eastAsia="Times New Roman" w:cs="Times New Roman"/>
+          <w:kern w:val="0"/>
+          <w:szCs w:val="28"/>
+          <w:lang w:val="ru-RU"/>
+          <w14:ligatures w14:val="none"/>
+        </w:rPr>
+        <w:t>агенстства</w:t>
+      </w:r>
+      <w:proofErr w:type="spellEnd"/>
+      <w:r>
+        <w:rPr>
+          <w:rFonts w:eastAsia="Times New Roman" w:cs="Times New Roman"/>
+          <w:kern w:val="0"/>
+          <w:szCs w:val="28"/>
+          <w:lang w:val="ru-RU"/>
+          <w14:ligatures w14:val="none"/>
+        </w:rPr>
+        <w:t>, квартирах, сдаваемых в аренду, работниках самого агентства, а также о состоянии сделок.</w:t>
       </w:r>
     </w:p>
     <w:p>
@@ -5847,13 +6359,22 @@
       <w:r>
         <w:rPr>
           <w:rFonts w:eastAsia="Times New Roman" w:cs="Times New Roman"/>
-          <w:color w:val="EE0000"/>
-          <w:kern w:val="0"/>
-          <w:szCs w:val="28"/>
-          <w:lang w:val="ru-RU"/>
-          <w14:ligatures w14:val="none"/>
-        </w:rPr>
-        <w:t xml:space="preserve">21 февраля </w:t>
+          <w:kern w:val="0"/>
+          <w:szCs w:val="28"/>
+          <w:lang w:val="ru-RU"/>
+          <w14:ligatures w14:val="none"/>
+        </w:rPr>
+        <w:t>10</w:t>
+      </w:r>
+      <w:r>
+        <w:rPr>
+          <w:rFonts w:eastAsia="Times New Roman" w:cs="Times New Roman"/>
+          <w:kern w:val="0"/>
+          <w:szCs w:val="28"/>
+          <w:lang w:val="ru-RU"/>
+          <w14:ligatures w14:val="none"/>
+        </w:rPr>
+        <w:t xml:space="preserve"> февраля </w:t>
       </w:r>
       <w:r>
         <w:rPr>
@@ -5924,7 +6445,7 @@
           <w:lang w:val="ru-RU"/>
           <w14:ligatures w14:val="none"/>
         </w:rPr>
-        <w:t>риелторской конторы</w:t>
+        <w:t>агентства недвижимости</w:t>
       </w:r>
       <w:r>
         <w:rPr>
@@ -6018,7 +6539,77 @@
           <w:lang w:val="ru-RU"/>
           <w14:ligatures w14:val="none"/>
         </w:rPr>
-        <w:t>Разрабатываемая база данных позволит улучшить доступность данных о маршрутах общественного транспорта города Череповца, тем самым ускорив и упростив поиск необходимой информации, и повысив уровень комфорта пассажиров при использовании общественного транспорта.</w:t>
+        <w:t xml:space="preserve">Разрабатываемая база данных позволит улучшить доступность данных о </w:t>
+      </w:r>
+      <w:r>
+        <w:rPr>
+          <w:rFonts w:eastAsia="Times New Roman" w:cs="Times New Roman"/>
+          <w:kern w:val="0"/>
+          <w:szCs w:val="28"/>
+          <w:lang w:val="ru-RU"/>
+          <w14:ligatures w14:val="none"/>
+        </w:rPr>
+        <w:t>текущем состоянии квартир и актуальных предложениях</w:t>
+      </w:r>
+      <w:r>
+        <w:rPr>
+          <w:rFonts w:eastAsia="Times New Roman" w:cs="Times New Roman"/>
+          <w:kern w:val="0"/>
+          <w:szCs w:val="28"/>
+          <w:lang w:val="ru-RU"/>
+          <w14:ligatures w14:val="none"/>
+        </w:rPr>
+        <w:t xml:space="preserve"> аренды</w:t>
+      </w:r>
+      <w:r>
+        <w:rPr>
+          <w:rFonts w:eastAsia="Times New Roman" w:cs="Times New Roman"/>
+          <w:kern w:val="0"/>
+          <w:szCs w:val="28"/>
+          <w:lang w:val="ru-RU"/>
+          <w14:ligatures w14:val="none"/>
+        </w:rPr>
+        <w:t xml:space="preserve">, тем самым ускорив и упростив поиск </w:t>
+      </w:r>
+      <w:r>
+        <w:rPr>
+          <w:rFonts w:eastAsia="Times New Roman" w:cs="Times New Roman"/>
+          <w:kern w:val="0"/>
+          <w:szCs w:val="28"/>
+          <w:lang w:val="ru-RU"/>
+          <w14:ligatures w14:val="none"/>
+        </w:rPr>
+        <w:t>подходящего предложения для клиента</w:t>
+      </w:r>
+      <w:r>
+        <w:rPr>
+          <w:rFonts w:eastAsia="Times New Roman" w:cs="Times New Roman"/>
+          <w:kern w:val="0"/>
+          <w:szCs w:val="28"/>
+          <w:lang w:val="ru-RU"/>
+          <w14:ligatures w14:val="none"/>
+        </w:rPr>
+        <w:t xml:space="preserve">, и повысив уровень </w:t>
+      </w:r>
+      <w:r>
+        <w:rPr>
+          <w:rFonts w:eastAsia="Times New Roman" w:cs="Times New Roman"/>
+          <w:kern w:val="0"/>
+          <w:szCs w:val="28"/>
+          <w:lang w:val="ru-RU"/>
+          <w14:ligatures w14:val="none"/>
+        </w:rPr>
+        <w:t>одобрения работы агентства среди клиентов</w:t>
+      </w:r>
+      <w:r>
+        <w:rPr>
+          <w:rFonts w:eastAsia="Times New Roman" w:cs="Times New Roman"/>
+          <w:kern w:val="0"/>
+          <w:szCs w:val="28"/>
+          <w:lang w:val="ru-RU"/>
+          <w14:ligatures w14:val="none"/>
+        </w:rPr>
+        <w:t>.</w:t>
       </w:r>
     </w:p>
     <w:p>
@@ -6163,7 +6754,127 @@
           <w:lang w:val="ru-RU"/>
           <w14:ligatures w14:val="none"/>
         </w:rPr>
-        <w:t>содержать актуальную и достоверную информацию об общественном транспорте г. Череповца: списки маршрутов, остановок, расписания, характеристики транспортных средств, тарифы, способы оплаты и другие данные;</w:t>
+        <w:t xml:space="preserve">содержать актуальную и достоверную информацию </w:t>
+      </w:r>
+      <w:r>
+        <w:rPr>
+          <w:rFonts w:eastAsia="Times New Roman" w:cs="Times New Roman"/>
+          <w:kern w:val="0"/>
+          <w:szCs w:val="28"/>
+          <w:lang w:val="ru-RU"/>
+          <w14:ligatures w14:val="none"/>
+        </w:rPr>
+        <w:t>о актуальных сделках о недвижимости</w:t>
+      </w:r>
+      <w:r>
+        <w:rPr>
+          <w:rFonts w:eastAsia="Times New Roman" w:cs="Times New Roman"/>
+          <w:kern w:val="0"/>
+          <w:szCs w:val="28"/>
+          <w:lang w:val="ru-RU"/>
+          <w14:ligatures w14:val="none"/>
+        </w:rPr>
+        <w:t xml:space="preserve">: </w:t>
+      </w:r>
+      <w:r>
+        <w:rPr>
+          <w:rFonts w:eastAsia="Times New Roman" w:cs="Times New Roman"/>
+          <w:kern w:val="0"/>
+          <w:szCs w:val="28"/>
+          <w:lang w:val="ru-RU"/>
+          <w14:ligatures w14:val="none"/>
+        </w:rPr>
+        <w:t xml:space="preserve">состояние, </w:t>
+      </w:r>
+      <w:r>
+        <w:rPr>
+          <w:rFonts w:eastAsia="Times New Roman" w:cs="Times New Roman"/>
+          <w:kern w:val="0"/>
+          <w:szCs w:val="28"/>
+          <w:lang w:val="ru-RU"/>
+          <w14:ligatures w14:val="none"/>
+        </w:rPr>
+        <w:t>стоимость</w:t>
+      </w:r>
+      <w:r>
+        <w:rPr>
+          <w:rFonts w:eastAsia="Times New Roman" w:cs="Times New Roman"/>
+          <w:kern w:val="0"/>
+          <w:szCs w:val="28"/>
+          <w:lang w:val="ru-RU"/>
+          <w14:ligatures w14:val="none"/>
+        </w:rPr>
+        <w:t xml:space="preserve">, </w:t>
+      </w:r>
+      <w:r>
+        <w:rPr>
+          <w:rFonts w:eastAsia="Times New Roman" w:cs="Times New Roman"/>
+          <w:kern w:val="0"/>
+          <w:szCs w:val="28"/>
+          <w:lang w:val="ru-RU"/>
+          <w14:ligatures w14:val="none"/>
+        </w:rPr>
+        <w:t>условия продавца</w:t>
+      </w:r>
+      <w:r>
+        <w:rPr>
+          <w:rFonts w:eastAsia="Times New Roman" w:cs="Times New Roman"/>
+          <w:kern w:val="0"/>
+          <w:szCs w:val="28"/>
+          <w:lang w:val="ru-RU"/>
+          <w14:ligatures w14:val="none"/>
+        </w:rPr>
+        <w:t xml:space="preserve"> </w:t>
+      </w:r>
+      <w:r>
+        <w:rPr>
+          <w:rFonts w:eastAsia="Times New Roman" w:cs="Times New Roman"/>
+          <w:kern w:val="0"/>
+          <w:szCs w:val="28"/>
+          <w:lang w:val="ru-RU"/>
+          <w14:ligatures w14:val="none"/>
+        </w:rPr>
+        <w:t>(</w:t>
+      </w:r>
+      <w:r>
+        <w:rPr>
+          <w:rFonts w:eastAsia="Times New Roman" w:cs="Times New Roman"/>
+          <w:kern w:val="0"/>
+          <w:szCs w:val="28"/>
+          <w:lang w:val="ru-RU"/>
+          <w14:ligatures w14:val="none"/>
+        </w:rPr>
+        <w:t>арендодателя</w:t>
+      </w:r>
+      <w:r>
+        <w:rPr>
+          <w:rFonts w:eastAsia="Times New Roman" w:cs="Times New Roman"/>
+          <w:kern w:val="0"/>
+          <w:szCs w:val="28"/>
+          <w:lang w:val="ru-RU"/>
+          <w14:ligatures w14:val="none"/>
+        </w:rPr>
+        <w:t>)</w:t>
+      </w:r>
+      <w:r>
+        <w:rPr>
+          <w:rFonts w:eastAsia="Times New Roman" w:cs="Times New Roman"/>
+          <w:kern w:val="0"/>
+          <w:szCs w:val="28"/>
+          <w:lang w:val="ru-RU"/>
+          <w14:ligatures w14:val="none"/>
+        </w:rPr>
+        <w:t>, кандидаты</w:t>
+      </w:r>
+      <w:r>
+        <w:rPr>
+          <w:rFonts w:eastAsia="Times New Roman" w:cs="Times New Roman"/>
+          <w:kern w:val="0"/>
+          <w:szCs w:val="28"/>
+          <w:lang w:val="ru-RU"/>
+          <w14:ligatures w14:val="none"/>
+        </w:rPr>
+        <w:t>;</w:t>
       </w:r>
     </w:p>
     <w:p>
@@ -6338,23 +7049,41 @@
         <w:jc w:val="left"/>
         <w:rPr>
           <w:rFonts w:eastAsia="Times New Roman" w:cs="Times New Roman"/>
-          <w:color w:val="EE0000"/>
-          <w:kern w:val="0"/>
-          <w:szCs w:val="28"/>
-          <w:lang w:val="ru-RU"/>
-          <w14:ligatures w14:val="none"/>
-        </w:rPr>
-      </w:pPr>
-      <w:r>
-        <w:rPr>
-          <w:rFonts w:eastAsia="Times New Roman" w:cs="Times New Roman"/>
-          <w:color w:val="EE0000"/>
-          <w:kern w:val="0"/>
-          <w:szCs w:val="28"/>
-          <w:lang w:val="ru-RU"/>
-          <w14:ligatures w14:val="none"/>
-        </w:rPr>
-        <w:t>иметь выбор из 2 пользователей: «Пассажир» и «Администратор»;</w:t>
+          <w:kern w:val="0"/>
+          <w:szCs w:val="28"/>
+          <w:lang w:val="ru-RU"/>
+          <w14:ligatures w14:val="none"/>
+        </w:rPr>
+      </w:pPr>
+      <w:r>
+        <w:rPr>
+          <w:rFonts w:eastAsia="Times New Roman" w:cs="Times New Roman"/>
+          <w:kern w:val="0"/>
+          <w:szCs w:val="28"/>
+          <w:lang w:val="ru-RU"/>
+          <w14:ligatures w14:val="none"/>
+        </w:rPr>
+        <w:t>иметь выбор из 2 пользователей: «</w:t>
+      </w:r>
+      <w:r>
+        <w:rPr>
+          <w:rFonts w:eastAsia="Times New Roman" w:cs="Times New Roman"/>
+          <w:kern w:val="0"/>
+          <w:szCs w:val="28"/>
+          <w:lang w:val="ru-RU"/>
+          <w14:ligatures w14:val="none"/>
+        </w:rPr>
+        <w:t>Риелтор</w:t>
+      </w:r>
+      <w:r>
+        <w:rPr>
+          <w:rFonts w:eastAsia="Times New Roman" w:cs="Times New Roman"/>
+          <w:kern w:val="0"/>
+          <w:szCs w:val="28"/>
+          <w:lang w:val="ru-RU"/>
+          <w14:ligatures w14:val="none"/>
+        </w:rPr>
+        <w:t>» и «Администратор»;</w:t>
       </w:r>
     </w:p>
     <w:p>
@@ -6371,23 +7100,41 @@
         <w:jc w:val="left"/>
         <w:rPr>
           <w:rFonts w:eastAsia="Times New Roman" w:cs="Times New Roman"/>
-          <w:color w:val="EE0000"/>
-          <w:kern w:val="0"/>
-          <w:szCs w:val="28"/>
-          <w:lang w:val="ru-RU"/>
-          <w14:ligatures w14:val="none"/>
-        </w:rPr>
-      </w:pPr>
-      <w:r>
-        <w:rPr>
-          <w:rFonts w:eastAsia="Times New Roman" w:cs="Times New Roman"/>
-          <w:color w:val="EE0000"/>
-          <w:kern w:val="0"/>
-          <w:szCs w:val="28"/>
-          <w:lang w:val="ru-RU"/>
-          <w14:ligatures w14:val="none"/>
-        </w:rPr>
-        <w:t xml:space="preserve">для пользователя «Пассажир» иметь возможность просмотра информации из базы данных через выполнение как минимум 30 запросов к ней; </w:t>
+          <w:kern w:val="0"/>
+          <w:szCs w:val="28"/>
+          <w:lang w:val="ru-RU"/>
+          <w14:ligatures w14:val="none"/>
+        </w:rPr>
+      </w:pPr>
+      <w:r>
+        <w:rPr>
+          <w:rFonts w:eastAsia="Times New Roman" w:cs="Times New Roman"/>
+          <w:kern w:val="0"/>
+          <w:szCs w:val="28"/>
+          <w:lang w:val="ru-RU"/>
+          <w14:ligatures w14:val="none"/>
+        </w:rPr>
+        <w:t>для пользователя «</w:t>
+      </w:r>
+      <w:r>
+        <w:rPr>
+          <w:rFonts w:eastAsia="Times New Roman" w:cs="Times New Roman"/>
+          <w:kern w:val="0"/>
+          <w:szCs w:val="28"/>
+          <w:lang w:val="ru-RU"/>
+          <w14:ligatures w14:val="none"/>
+        </w:rPr>
+        <w:t>Риелтор</w:t>
+      </w:r>
+      <w:r>
+        <w:rPr>
+          <w:rFonts w:eastAsia="Times New Roman" w:cs="Times New Roman"/>
+          <w:kern w:val="0"/>
+          <w:szCs w:val="28"/>
+          <w:lang w:val="ru-RU"/>
+          <w14:ligatures w14:val="none"/>
+        </w:rPr>
+        <w:t xml:space="preserve">» иметь возможность просмотра информации из базы данных через выполнение как минимум 30 запросов к ней; </w:t>
       </w:r>
     </w:p>
     <w:p>
@@ -6404,23 +7151,31 @@
         <w:jc w:val="left"/>
         <w:rPr>
           <w:rFonts w:eastAsia="Times New Roman" w:cs="Times New Roman"/>
-          <w:color w:val="EE0000"/>
-          <w:kern w:val="0"/>
-          <w:szCs w:val="28"/>
-          <w:lang w:val="ru-RU"/>
-          <w14:ligatures w14:val="none"/>
-        </w:rPr>
-      </w:pPr>
-      <w:r>
-        <w:rPr>
-          <w:rFonts w:eastAsia="Times New Roman" w:cs="Times New Roman"/>
-          <w:color w:val="EE0000"/>
-          <w:kern w:val="0"/>
-          <w:szCs w:val="28"/>
-          <w:lang w:val="ru-RU"/>
-          <w14:ligatures w14:val="none"/>
-        </w:rPr>
-        <w:t xml:space="preserve">для пользователя «Администратор» иметь возможность добавления, редактирования и удаления записей в базе данных (для администратора); </w:t>
+          <w:kern w:val="0"/>
+          <w:szCs w:val="28"/>
+          <w:lang w:val="ru-RU"/>
+          <w14:ligatures w14:val="none"/>
+        </w:rPr>
+      </w:pPr>
+      <w:r>
+        <w:rPr>
+          <w:rFonts w:eastAsia="Times New Roman" w:cs="Times New Roman"/>
+          <w:kern w:val="0"/>
+          <w:szCs w:val="28"/>
+          <w:lang w:val="ru-RU"/>
+          <w14:ligatures w14:val="none"/>
+        </w:rPr>
+        <w:t>для пользователя «Риелтор» иметь возможность актуализировать данные о сделках через формы</w:t>
+      </w:r>
+      <w:r>
+        <w:rPr>
+          <w:rFonts w:eastAsia="Times New Roman" w:cs="Times New Roman"/>
+          <w:kern w:val="0"/>
+          <w:szCs w:val="28"/>
+          <w:lang w:val="ru-RU"/>
+          <w14:ligatures w14:val="none"/>
+        </w:rPr>
+        <w:t>;</w:t>
       </w:r>
     </w:p>
     <w:p>
@@ -6437,35 +7192,21 @@
         <w:jc w:val="left"/>
         <w:rPr>
           <w:rFonts w:eastAsia="Times New Roman" w:cs="Times New Roman"/>
-          <w:color w:val="EE0000"/>
-          <w:kern w:val="0"/>
-          <w:szCs w:val="28"/>
-          <w:lang w:val="ru-RU"/>
-          <w14:ligatures w14:val="none"/>
-        </w:rPr>
-      </w:pPr>
-      <w:r>
-        <w:rPr>
-          <w:rFonts w:eastAsia="Times New Roman" w:cs="Times New Roman"/>
-          <w:color w:val="EE0000"/>
-          <w:kern w:val="0"/>
-          <w:szCs w:val="28"/>
-          <w:lang w:val="ru-RU"/>
-          <w14:ligatures w14:val="none"/>
-        </w:rPr>
-        <w:t xml:space="preserve">для пользователя «Администратор» запрашивать пароль при входе в </w:t>
-      </w:r>
-      <w:r>
-        <w:rPr>
-          <w:rFonts w:eastAsia="Times New Roman" w:cs="Times New Roman"/>
-          <w:color w:val="EE0000"/>
-          <w:kern w:val="0"/>
-          <w:szCs w:val="28"/>
-          <w:lang w:val="ru-RU"/>
-          <w14:ligatures w14:val="none"/>
-        </w:rPr>
-        <w:lastRenderedPageBreak/>
-        <w:t>программу, чтобы защитить информацию в базе данных;</w:t>
+          <w:kern w:val="0"/>
+          <w:szCs w:val="28"/>
+          <w:lang w:val="ru-RU"/>
+          <w14:ligatures w14:val="none"/>
+        </w:rPr>
+      </w:pPr>
+      <w:r>
+        <w:rPr>
+          <w:rFonts w:eastAsia="Times New Roman" w:cs="Times New Roman"/>
+          <w:kern w:val="0"/>
+          <w:szCs w:val="28"/>
+          <w:lang w:val="ru-RU"/>
+          <w14:ligatures w14:val="none"/>
+        </w:rPr>
+        <w:t xml:space="preserve">для пользователя «Администратор» иметь возможность добавления, редактирования и удаления записей в базе данных (для администратора); </w:t>
       </w:r>
     </w:p>
     <w:p>
@@ -6496,6 +7237,38 @@
           <w:lang w:val="ru-RU"/>
           <w14:ligatures w14:val="none"/>
         </w:rPr>
+        <w:lastRenderedPageBreak/>
+        <w:t>для пользователя «Администратор» запрашивать пароль при входе в программу, чтобы защитить информацию в базе данных;</w:t>
+      </w:r>
+    </w:p>
+    <w:p>
+      <w:pPr>
+        <w:widowControl w:val="0"/>
+        <w:numPr>
+          <w:ilvl w:val="0"/>
+          <w:numId w:val="7"/>
+        </w:numPr>
+        <w:autoSpaceDE w:val="0"/>
+        <w:autoSpaceDN w:val="0"/>
+        <w:ind w:left="993" w:hanging="283"/>
+        <w:contextualSpacing/>
+        <w:jc w:val="left"/>
+        <w:rPr>
+          <w:rFonts w:eastAsia="Times New Roman" w:cs="Times New Roman"/>
+          <w:kern w:val="0"/>
+          <w:szCs w:val="28"/>
+          <w:lang w:val="ru-RU"/>
+          <w14:ligatures w14:val="none"/>
+        </w:rPr>
+      </w:pPr>
+      <w:r>
+        <w:rPr>
+          <w:rFonts w:eastAsia="Times New Roman" w:cs="Times New Roman"/>
+          <w:kern w:val="0"/>
+          <w:szCs w:val="28"/>
+          <w:lang w:val="ru-RU"/>
+          <w14:ligatures w14:val="none"/>
+        </w:rPr>
         <w:t xml:space="preserve">иметь удобный интерфейс в стиле </w:t>
       </w:r>
       <w:r>
@@ -7720,18 +8493,8 @@
           <w:lang w:val="ru-RU"/>
           <w14:ligatures w14:val="none"/>
         </w:rPr>
-        <w:t xml:space="preserve">К разрабатываемой базе данных и программе предъявляются следующие </w:t>
-      </w:r>
-      <w:r>
-        <w:rPr>
-          <w:rFonts w:eastAsia="Times New Roman" w:cs="Times New Roman"/>
-          <w:kern w:val="0"/>
-          <w:szCs w:val="28"/>
-          <w:lang w:val="ru-RU"/>
-          <w14:ligatures w14:val="none"/>
-        </w:rPr>
         <w:lastRenderedPageBreak/>
-        <w:t>требования:</w:t>
+        <w:t>К разрабатываемой базе данных и программе предъявляются следующие требования:</w:t>
       </w:r>
     </w:p>
     <w:p>
@@ -8822,7 +9585,7 @@
           <w:color w:val="000000"/>
           <w:kern w:val="0"/>
           <w:szCs w:val="28"/>
-          <w:lang w:val="en-US"/>
+          <w:lang w:val="ru-RU"/>
           <w14:ligatures w14:val="none"/>
         </w:rPr>
       </w:pPr>
@@ -8838,7 +9601,7 @@
           <w:color w:val="000000"/>
           <w:kern w:val="0"/>
           <w:szCs w:val="28"/>
-          <w:lang w:val="en-US"/>
+          <w:lang w:val="ru-RU"/>
           <w14:ligatures w14:val="none"/>
         </w:rPr>
       </w:pPr>
@@ -11185,7 +11948,7 @@
           <w:rFonts w:eastAsia="Times New Roman" w:cs="Times New Roman"/>
           <w:kern w:val="0"/>
           <w:szCs w:val="28"/>
-          <w:lang w:val="en-US"/>
+          <w:lang w:val="ru-RU"/>
           <w14:ligatures w14:val="none"/>
         </w:rPr>
       </w:pPr>
@@ -11285,9 +12048,10 @@
         </w:r>
         <w:r>
           <w:rPr>
+            <w:noProof/>
             <w:szCs w:val="28"/>
           </w:rPr>
-          <w:t>2</w:t>
+          <w:t>10</w:t>
         </w:r>
         <w:r>
           <w:rPr>
@@ -11334,12 +12098,6 @@
             <w:rStyle w:val="af0"/>
           </w:rPr>
           <w:instrText xml:space="preserve"> PAGE </w:instrText>
-        </w:r>
-        <w:r>
-          <w:rPr>
-            <w:rStyle w:val="af0"/>
-          </w:rPr>
-          <w:fldChar w:fldCharType="separate"/>
         </w:r>
         <w:r>
           <w:rPr>
@@ -11403,7 +12161,14 @@
             <w:rStyle w:val="af0"/>
             <w:noProof/>
           </w:rPr>
-          <w:t>8</w:t>
+          <w:t>1</w:t>
+        </w:r>
+        <w:r>
+          <w:rPr>
+            <w:rStyle w:val="af0"/>
+            <w:noProof/>
+          </w:rPr>
+          <w:t>4</w:t>
         </w:r>
         <w:r>
           <w:rPr>
@@ -12372,6 +13137,119 @@
     </w:lvl>
   </w:abstractNum>
   <w:abstractNum w:abstractNumId="8" w15:restartNumberingAfterBreak="0">
+    <w:nsid w:val="74727B74"/>
+    <w:multiLevelType w:val="hybridMultilevel"/>
+    <w:tmpl w:val="8F4E0D04"/>
+    <w:lvl w:ilvl="0" w:tplc="04190001">
+      <w:start w:val="1"/>
+      <w:numFmt w:val="bullet"/>
+      <w:lvlText w:val=""/>
+      <w:lvlJc w:val="left"/>
+      <w:pPr>
+        <w:ind w:left="720" w:hanging="360"/>
+      </w:pPr>
+      <w:rPr>
+        <w:rFonts w:ascii="Symbol" w:hAnsi="Symbol" w:hint="default"/>
+      </w:rPr>
+    </w:lvl>
+    <w:lvl w:ilvl="1" w:tplc="04190003" w:tentative="1">
+      <w:start w:val="1"/>
+      <w:numFmt w:val="bullet"/>
+      <w:lvlText w:val="o"/>
+      <w:lvlJc w:val="left"/>
+      <w:pPr>
+        <w:ind w:left="1440" w:hanging="360"/>
+      </w:pPr>
+      <w:rPr>
+        <w:rFonts w:ascii="Courier New" w:hAnsi="Courier New" w:cs="Courier New" w:hint="default"/>
+      </w:rPr>
+    </w:lvl>
+    <w:lvl w:ilvl="2" w:tplc="04190005" w:tentative="1">
+      <w:start w:val="1"/>
+      <w:numFmt w:val="bullet"/>
+      <w:lvlText w:val=""/>
+      <w:lvlJc w:val="left"/>
+      <w:pPr>
+        <w:ind w:left="2160" w:hanging="360"/>
+      </w:pPr>
+      <w:rPr>
+        <w:rFonts w:ascii="Wingdings" w:hAnsi="Wingdings" w:hint="default"/>
+      </w:rPr>
+    </w:lvl>
+    <w:lvl w:ilvl="3" w:tplc="04190001" w:tentative="1">
+      <w:start w:val="1"/>
+      <w:numFmt w:val="bullet"/>
+      <w:lvlText w:val=""/>
+      <w:lvlJc w:val="left"/>
+      <w:pPr>
+        <w:ind w:left="2880" w:hanging="360"/>
+      </w:pPr>
+      <w:rPr>
+        <w:rFonts w:ascii="Symbol" w:hAnsi="Symbol" w:hint="default"/>
+      </w:rPr>
+    </w:lvl>
+    <w:lvl w:ilvl="4" w:tplc="04190003" w:tentative="1">
+      <w:start w:val="1"/>
+      <w:numFmt w:val="bullet"/>
+      <w:lvlText w:val="o"/>
+      <w:lvlJc w:val="left"/>
+      <w:pPr>
+        <w:ind w:left="3600" w:hanging="360"/>
+      </w:pPr>
+      <w:rPr>
+        <w:rFonts w:ascii="Courier New" w:hAnsi="Courier New" w:cs="Courier New" w:hint="default"/>
+      </w:rPr>
+    </w:lvl>
+    <w:lvl w:ilvl="5" w:tplc="04190005" w:tentative="1">
+      <w:start w:val="1"/>
+      <w:numFmt w:val="bullet"/>
+      <w:lvlText w:val=""/>
+      <w:lvlJc w:val="left"/>
+      <w:pPr>
+        <w:ind w:left="4320" w:hanging="360"/>
+      </w:pPr>
+      <w:rPr>
+        <w:rFonts w:ascii="Wingdings" w:hAnsi="Wingdings" w:hint="default"/>
+      </w:rPr>
+    </w:lvl>
+    <w:lvl w:ilvl="6" w:tplc="04190001" w:tentative="1">
+      <w:start w:val="1"/>
+      <w:numFmt w:val="bullet"/>
+      <w:lvlText w:val=""/>
+      <w:lvlJc w:val="left"/>
+      <w:pPr>
+        <w:ind w:left="5040" w:hanging="360"/>
+      </w:pPr>
+      <w:rPr>
+        <w:rFonts w:ascii="Symbol" w:hAnsi="Symbol" w:hint="default"/>
+      </w:rPr>
+    </w:lvl>
+    <w:lvl w:ilvl="7" w:tplc="04190003" w:tentative="1">
+      <w:start w:val="1"/>
+      <w:numFmt w:val="bullet"/>
+      <w:lvlText w:val="o"/>
+      <w:lvlJc w:val="left"/>
+      <w:pPr>
+        <w:ind w:left="5760" w:hanging="360"/>
+      </w:pPr>
+      <w:rPr>
+        <w:rFonts w:ascii="Courier New" w:hAnsi="Courier New" w:cs="Courier New" w:hint="default"/>
+      </w:rPr>
+    </w:lvl>
+    <w:lvl w:ilvl="8" w:tplc="04190005" w:tentative="1">
+      <w:start w:val="1"/>
+      <w:numFmt w:val="bullet"/>
+      <w:lvlText w:val=""/>
+      <w:lvlJc w:val="left"/>
+      <w:pPr>
+        <w:ind w:left="6480" w:hanging="360"/>
+      </w:pPr>
+      <w:rPr>
+        <w:rFonts w:ascii="Wingdings" w:hAnsi="Wingdings" w:hint="default"/>
+      </w:rPr>
+    </w:lvl>
+  </w:abstractNum>
+  <w:abstractNum w:abstractNumId="9" w15:restartNumberingAfterBreak="0">
     <w:nsid w:val="7FD44394"/>
     <w:multiLevelType w:val="multilevel"/>
     <w:tmpl w:val="AA06370E"/>
@@ -12493,32 +13371,35 @@
       </w:rPr>
     </w:lvl>
   </w:abstractNum>
-  <w:num w:numId="1" w16cid:durableId="633364130">
+  <w:num w:numId="1" w16cid:durableId="2122071666">
     <w:abstractNumId w:val="1"/>
   </w:num>
-  <w:num w:numId="2" w16cid:durableId="1478063738">
+  <w:num w:numId="2" w16cid:durableId="73674643">
     <w:abstractNumId w:val="0"/>
   </w:num>
-  <w:num w:numId="3" w16cid:durableId="782580898">
+  <w:num w:numId="3" w16cid:durableId="78450057">
     <w:abstractNumId w:val="2"/>
   </w:num>
-  <w:num w:numId="4" w16cid:durableId="324017584">
+  <w:num w:numId="4" w16cid:durableId="1505585356">
     <w:abstractNumId w:val="3"/>
   </w:num>
-  <w:num w:numId="5" w16cid:durableId="284627224">
+  <w:num w:numId="5" w16cid:durableId="987516693">
     <w:abstractNumId w:val="7"/>
   </w:num>
-  <w:num w:numId="6" w16cid:durableId="122504320">
+  <w:num w:numId="6" w16cid:durableId="1430539431">
     <w:abstractNumId w:val="5"/>
   </w:num>
-  <w:num w:numId="7" w16cid:durableId="1087922255">
+  <w:num w:numId="7" w16cid:durableId="1153638766">
     <w:abstractNumId w:val="4"/>
   </w:num>
-  <w:num w:numId="8" w16cid:durableId="1889607008">
+  <w:num w:numId="8" w16cid:durableId="1857578797">
+    <w:abstractNumId w:val="9"/>
+  </w:num>
+  <w:num w:numId="9" w16cid:durableId="2013144021">
+    <w:abstractNumId w:val="6"/>
+  </w:num>
+  <w:num w:numId="10" w16cid:durableId="784691990">
     <w:abstractNumId w:val="8"/>
-  </w:num>
-  <w:num w:numId="9" w16cid:durableId="308172023">
-    <w:abstractNumId w:val="6"/>
   </w:num>
 </w:numbering>
 </file>
@@ -13312,6 +14193,7 @@
       <w:numPr>
         <w:ilvl w:val="1"/>
       </w:numPr>
+      <w:ind w:firstLine="425"/>
     </w:pPr>
     <w:rPr>
       <w:rFonts w:eastAsiaTheme="majorEastAsia" w:cstheme="majorBidi"/>
@@ -14052,7 +14934,7 @@
 </file>
 
 <file path=customXml/itemProps1.xml><?xml version="1.0" encoding="utf-8"?>
-<ds:datastoreItem xmlns:ds="http://schemas.openxmlformats.org/officeDocument/2006/customXml" ds:itemID="{F3C89796-B9E6-2C42-AD28-1FB6582B93BD}">
+<ds:datastoreItem xmlns:ds="http://schemas.openxmlformats.org/officeDocument/2006/customXml" ds:itemID="{4408A8FB-746F-412A-BA56-25B5DFE04856}">
   <ds:schemaRefs>
     <ds:schemaRef ds:uri="http://schemas.openxmlformats.org/officeDocument/2006/bibliography"/>
   </ds:schemaRefs>

</xml_diff>